<commit_message>
Avtal §1: org.nr- och kontaktfalt for bada parter (ifylls vid signering)
Co-Authored-By: Claude Fable 5 <noreply@anthropic.com>
</commit_message>
<xml_diff>
--- a/Tjansteavtal-Cecilia-K.docx
+++ b/Tjansteavtal-Cecilia-K.docx
@@ -66,20 +66,71 @@
           <w:sz w:val="20"/>
           <w:szCs w:val="20"/>
         </w:rPr>
-        <w:t xml:space="preserve">Leverantör: Oliver Pettersson, PathfinderAI, oliver@pathfinderai.se ("Leverantören").</w:t>
-      </w:r>
-    </w:p>
-    <w:p>
-      <w:pPr>
-        <w:spacing w:after="100"/>
-      </w:pPr>
-      <w:r>
-        <w:rPr>
-          <w:rFonts w:ascii="Calibri" w:cs="Calibri" w:eastAsia="Calibri" w:hAnsi="Calibri"/>
-          <w:sz w:val="20"/>
-          <w:szCs w:val="20"/>
-        </w:rPr>
-        <w:t xml:space="preserve">Beställare: Cecilia Kristoffersson, enskild näringsidkare, verksamheten Constcollection by Cecilia K., Växjögatan 5F, 252 51 Helsingborg ("Beställaren").</w:t>
+        <w:t xml:space="preserve">Leverantör: Oliver Pettersson, enskild firma PathfinderAI ("Leverantören")</w:t>
+      </w:r>
+    </w:p>
+    <w:p>
+      <w:pPr>
+        <w:spacing w:after="100"/>
+      </w:pPr>
+      <w:r>
+        <w:rPr>
+          <w:rFonts w:ascii="Calibri" w:cs="Calibri" w:eastAsia="Calibri" w:hAnsi="Calibri"/>
+          <w:sz w:val="20"/>
+          <w:szCs w:val="20"/>
+        </w:rPr>
+        <w:t xml:space="preserve">Org.nr: ______________________  ·  E-post: oliver@pathfinderai.se  ·  Telefon: ______________________</w:t>
+      </w:r>
+    </w:p>
+    <w:p>
+      <w:pPr>
+        <w:spacing w:after="200"/>
+      </w:pPr>
+      <w:r>
+        <w:rPr>
+          <w:sz w:val="12"/>
+          <w:szCs w:val="12"/>
+        </w:rPr>
+        <w:t xml:space="preserve"/>
+      </w:r>
+    </w:p>
+    <w:p>
+      <w:pPr>
+        <w:spacing w:after="100"/>
+      </w:pPr>
+      <w:r>
+        <w:rPr>
+          <w:rFonts w:ascii="Calibri" w:cs="Calibri" w:eastAsia="Calibri" w:hAnsi="Calibri"/>
+          <w:sz w:val="20"/>
+          <w:szCs w:val="20"/>
+        </w:rPr>
+        <w:t xml:space="preserve">Beställare: Cecilia Kristoffersson, enskild näringsidkare, verksamheten Constcollection by Cecilia K. ("Beställaren")</w:t>
+      </w:r>
+    </w:p>
+    <w:p>
+      <w:pPr>
+        <w:spacing w:after="100"/>
+      </w:pPr>
+      <w:r>
+        <w:rPr>
+          <w:rFonts w:ascii="Calibri" w:cs="Calibri" w:eastAsia="Calibri" w:hAnsi="Calibri"/>
+          <w:sz w:val="20"/>
+          <w:szCs w:val="20"/>
+        </w:rPr>
+        <w:t xml:space="preserve">Adress: Växjögatan 5F, 252 51 Helsingborg</w:t>
+      </w:r>
+    </w:p>
+    <w:p>
+      <w:pPr>
+        <w:spacing w:after="100"/>
+      </w:pPr>
+      <w:r>
+        <w:rPr>
+          <w:rFonts w:ascii="Calibri" w:cs="Calibri" w:eastAsia="Calibri" w:hAnsi="Calibri"/>
+          <w:sz w:val="20"/>
+          <w:szCs w:val="20"/>
+        </w:rPr>
+        <w:t xml:space="preserve">Org.nr: ______________________  ·  E-post: ______________________  ·  Telefon: ______________________</w:t>
       </w:r>
     </w:p>
     <w:p>

</xml_diff>

<commit_message>
Avtal: §10 fortydligat att kod/losning ej overlats vid upphorande, betalningsvillkor 30 dagar
Co-Authored-By: Claude Fable 5 <noreply@anthropic.com>
</commit_message>
<xml_diff>
--- a/Tjansteavtal-Cecilia-K.docx
+++ b/Tjansteavtal-Cecilia-K.docx
@@ -442,7 +442,7 @@
           <w:sz w:val="20"/>
           <w:szCs w:val="20"/>
         </w:rPr>
-        <w:t xml:space="preserve">Faktura utställs var 6:e månad i förskott: 3 894 kr inkl. moms per faktura. Betalningsvillkor 20 dagar.</w:t>
+        <w:t xml:space="preserve">Faktura utställs var 6:e månad i förskott: 3 894 kr inkl. moms per faktura. Betalningsvillkor 30 dagar.</w:t>
       </w:r>
     </w:p>
     <w:p>
@@ -786,7 +786,7 @@
           <w:sz w:val="20"/>
           <w:szCs w:val="20"/>
         </w:rPr>
-        <w:t xml:space="preserve">Vid avtalets upphörande överlåts allt innehåll och domänen fullständigt till Beställaren; Leverantören bistår vid överlämning.</w:t>
+        <w:t xml:space="preserve">Vid avtalets upphörande överlåts allt innehåll enligt första stycket samt domänen fullständigt till Beställaren; Leverantören bistår vid överlämning av dessa. Koden, tekniken och webshoppslösningen omfattas inte av överlåtelsen — de förblir Leverantörens egendom och Beställarens nyttjanderätt till dem upphör när avtalet upphör.</w:t>
       </w:r>
     </w:p>
     <w:p>

</xml_diff>